<commit_message>
Add graduation year across all resumes; correct Level Agency employment type
Josh confirmed his CSU graduation year (2009) - added to
master-profile.md and all four built resumes, closing the gap Checkr's
resume reviewer flagged. Also confirmed Level Agency was full-time, not
a contract, so the reviewer's suggested "(Contract)" label was not
applied - it stays a normal full-time role. Private context on the
departure is recorded in master-profile.md for Josh's own interview
prep only, explicitly marked never for resume/cover-letter/application
use. Cascaded the tightened Accelo sales-rank bullet (27-month tenure,
no vague hedge) to the two resumes that hadn't picked it up yet.

Co-Authored-By: Claude Sonnet 5 <noreply@anthropic.com>
Claude-Session: https://claude.ai/code/session_01DF84Bh4cXDnetBnrLWQPKU
</commit_message>
<xml_diff>
--- a/applications/adventure-amore-wedding-sales-consultant/Rotenberg Resume - Adventure Amore - Wedding Sales Consultant.docx
+++ b/applications/adventure-amore-wedding-sales-consultant/Rotenberg Resume - Adventure Amore - Wedding Sales Consultant.docx
@@ -705,7 +705,7 @@
           <w:i w:val="0"/>
           <w:color w:val="1A1A1A"/>
         </w:rPr>
-        <w:t>Ranked top three in sales on a team of 8-15 reps for effectively the full tenure, holding that ranking while quota roughly doubled over the period.</w:t>
+        <w:t>Ranked top three in sales on a team that scaled from 8 to 15 reps, holding that rank across all but the final few months of a 27-month tenure while quota roughly doubled.</w:t>
       </w:r>
     </w:p>
     <w:p>
@@ -1000,7 +1000,7 @@
           <w:i w:val="0"/>
           <w:color w:val="1A1A1A"/>
         </w:rPr>
-        <w:t>B.A. Liberal Arts, Minor in Political Science - Colorado State University, Fort Collins, CO</w:t>
+        <w:t>B.A. Liberal Arts, Minor in Political Science - Colorado State University, Fort Collins, CO (2009)</w:t>
       </w:r>
     </w:p>
     <w:p>

</xml_diff>